<commit_message>
Add Tier 4 commodity-linked tokens (XAU/XAG/CL)
Per updated v5 spec:
- Tier 4 = commodity tokens (gold, silver, crude oil)
- Exempt from BTC alignment (fully independent of crypto)
- Exempt from ADX-based regime; uses own Daily structural regime
- Own per-asset volatility-suppression check
- BTC volatility suppression no longer halts Tier 4 scanning
</commit_message>
<xml_diff>
--- a/Trading_Bot_Final_Prompt_v5.docx
+++ b/Trading_Bot_Final_Prompt_v5.docx
@@ -299,7 +299,52 @@
         <w:pStyle w:val="Heading2"/>
       </w:pPr>
       <w:r>
+        <w:rPr>
+          <w:iCs/>
+        </w:rPr>
         <w:lastRenderedPageBreak/>
+        <w:t>Tier 4 — Commodity-Linked Tokens</w:t>
+      </w:r>
+      <w:r>
+        <w:t xml:space="preserve"> </w:t>
+      </w:r>
+    </w:p>
+    <w:p>
+      <w:pPr>
+        <w:spacing w:after="60"/>
+        <w:rPr>
+          <w:iCs/>
+        </w:rPr>
+      </w:pPr>
+      <w:r>
+        <w:rPr>
+          <w:iCs/>
+        </w:rPr>
+        <w:t>XAUUSDT, XAGUSDT, CLUSDT and equivalent commodity-backed tokens available on Binance.</w:t>
+      </w:r>
+      <w:r>
+        <w:t xml:space="preserve"> </w:t>
+      </w:r>
+      <w:r>
+        <w:rPr>
+          <w:iCs/>
+        </w:rPr>
+        <w:t>Requirement: Asset's own 4H/Daily structure only. No BTC alignment required or applied. Treat as fully independent from crypto market regime — commodity price action and macro drivers govern structure."</w:t>
+      </w:r>
+    </w:p>
+    <w:p>
+      <w:pPr>
+        <w:spacing w:after="60"/>
+        <w:rPr>
+          <w:iCs/>
+        </w:rPr>
+      </w:pPr>
+    </w:p>
+    <w:p>
+      <w:pPr>
+        <w:pStyle w:val="Heading2"/>
+      </w:pPr>
+      <w:r>
         <w:t>Cooldown Rule</w:t>
       </w:r>
     </w:p>
@@ -416,9 +461,19 @@
       </w:r>
     </w:p>
     <w:p>
-      <w:bookmarkStart w:id="0" w:name="_GoBack"/>
-      <w:bookmarkEnd w:id="0"/>
-    </w:p>
+      <w:pPr>
+        <w:pStyle w:val="ListParagraph"/>
+        <w:numPr>
+          <w:ilvl w:val="0"/>
+          <w:numId w:val="2"/>
+        </w:numPr>
+        <w:spacing w:after="40"/>
+      </w:pPr>
+      <w:r>
+        <w:t>Tier 4 assets are exempt from ADX-based regime classification. Market regime for Tier 4 is determined solely by the asset's own 4H/Daily structural behavior.</w:t>
+      </w:r>
+    </w:p>
+    <w:p/>
     <w:p>
       <w:pPr>
         <w:pBdr>
@@ -511,6 +566,8 @@
       <w:r>
         <w:t>15M</w:t>
       </w:r>
+      <w:bookmarkStart w:id="0" w:name="_GoBack"/>
+      <w:bookmarkEnd w:id="0"/>
     </w:p>
     <w:p/>
     <w:p>
@@ -949,7 +1006,6 @@
         <w:spacing w:after="40"/>
       </w:pPr>
       <w:r>
-        <w:lastRenderedPageBreak/>
         <w:t>First confirmed candle CLOSE outside the boundary with range expansion (breakout/breakdown)</w:t>
       </w:r>
     </w:p>
@@ -1255,6 +1311,7 @@
         <w:spacing w:after="40"/>
       </w:pPr>
       <w:r>
+        <w:lastRenderedPageBreak/>
         <w:t>Trigger: first candle CLOSE beyond the flat boundary</w:t>
       </w:r>
     </w:p>
@@ -1637,6 +1694,7 @@
         <w:spacing w:after="60"/>
       </w:pPr>
       <w:r>
+        <w:lastRenderedPageBreak/>
         <w:t>Reversal patterns: neckline level — the candle close that confirmed the pattern trigger becomes the Stage 2 retest zone.</w:t>
       </w:r>
     </w:p>
@@ -1671,7 +1729,6 @@
         <w:spacing w:after="60"/>
       </w:pPr>
       <w:r>
-        <w:lastRenderedPageBreak/>
         <w:t>Liquidity is a probability amplifier and target identifier — not a direction signal. Condition D must align with Condition A or C to contribute to a delivered alert.</w:t>
       </w:r>
     </w:p>
@@ -2056,229 +2113,229 @@
         <w:spacing w:after="40"/>
       </w:pPr>
       <w:r>
+        <w:t>Condition C: FVG left by displacement candle, OB at origin, or imbalance zone</w:t>
+      </w:r>
+    </w:p>
+    <w:p>
+      <w:pPr>
+        <w:pStyle w:val="ListParagraph"/>
+        <w:numPr>
+          <w:ilvl w:val="0"/>
+          <w:numId w:val="2"/>
+        </w:numPr>
+        <w:spacing w:after="40"/>
+      </w:pPr>
+      <w:r>
+        <w:t>Condition B — Continuation: compression boundary — last 1–2 candle bodies forming the boundary before the breakout candle</w:t>
+      </w:r>
+    </w:p>
+    <w:p>
+      <w:pPr>
+        <w:pStyle w:val="ListParagraph"/>
+        <w:numPr>
+          <w:ilvl w:val="0"/>
+          <w:numId w:val="2"/>
+        </w:numPr>
+        <w:spacing w:after="40"/>
+      </w:pPr>
+      <w:r>
+        <w:t>Condition B — Reversal: neckline level at which the pattern trigger candle closed</w:t>
+      </w:r>
+    </w:p>
+    <w:p>
+      <w:pPr>
+        <w:pStyle w:val="ListParagraph"/>
+        <w:numPr>
+          <w:ilvl w:val="0"/>
+          <w:numId w:val="2"/>
+        </w:numPr>
+        <w:spacing w:after="40"/>
+      </w:pPr>
+      <w:r>
+        <w:t>Condition D: retracement zone is defined by the liquidity level interacted with — price is expected to retest the sweep level</w:t>
+      </w:r>
+    </w:p>
+    <w:p/>
+    <w:p>
+      <w:pPr>
+        <w:spacing w:after="60"/>
+      </w:pPr>
+      <w:r>
+        <w:rPr>
+          <w:b/>
+          <w:bCs/>
+        </w:rPr>
+        <w:t>Step 2 — Wait for price to enter the defined zone. LTF validation does not begin until price is inside the zone boundaries.</w:t>
+      </w:r>
+    </w:p>
+    <w:p/>
+    <w:p>
+      <w:pPr>
+        <w:spacing w:after="60"/>
+      </w:pPr>
+      <w:r>
+        <w:rPr>
+          <w:b/>
+          <w:bCs/>
+        </w:rPr>
+        <w:t>Step 3 — Require LTF Validation (1H or 15M):</w:t>
+      </w:r>
+    </w:p>
+    <w:p>
+      <w:pPr>
+        <w:spacing w:after="60"/>
+      </w:pPr>
+      <w:r>
+        <w:t>Price must be inside the defined zone. Then at least ONE of the following must confirm on 1H or 15M:</w:t>
+      </w:r>
+    </w:p>
+    <w:p>
+      <w:pPr>
+        <w:pStyle w:val="ListParagraph"/>
+        <w:numPr>
+          <w:ilvl w:val="0"/>
+          <w:numId w:val="2"/>
+        </w:numPr>
+        <w:spacing w:after="40"/>
+      </w:pPr>
+      <w:r>
+        <w:t>Micro market structure shift in the intended trade direction</w:t>
+      </w:r>
+    </w:p>
+    <w:p>
+      <w:pPr>
+        <w:pStyle w:val="ListParagraph"/>
+        <w:numPr>
+          <w:ilvl w:val="0"/>
+          <w:numId w:val="2"/>
+        </w:numPr>
+        <w:spacing w:after="40"/>
+      </w:pPr>
+      <w:r>
+        <w:t>Displacement candle with body size greater than the prior 3-candle average, closing away from the zone</w:t>
+      </w:r>
+    </w:p>
+    <w:p>
+      <w:pPr>
+        <w:pStyle w:val="ListParagraph"/>
+        <w:numPr>
+          <w:ilvl w:val="0"/>
+          <w:numId w:val="2"/>
+        </w:numPr>
+        <w:spacing w:after="40"/>
+      </w:pPr>
+      <w:r>
+        <w:t>Clear rejection candle with body closing away from the zone boundary — wick into zone, body outside</w:t>
+      </w:r>
+    </w:p>
+    <w:p/>
+    <w:p>
+      <w:pPr>
+        <w:spacing w:after="60"/>
+      </w:pPr>
+      <w:r>
+        <w:t>Optional confluence rule: if two or more LTF conditions occur simultaneously, automatically add +1 to the confidence score before delivery assessment.</w:t>
+      </w:r>
+    </w:p>
+    <w:p/>
+    <w:p>
+      <w:pPr>
+        <w:spacing w:after="100"/>
+      </w:pPr>
+      <w:r>
+        <w:rPr>
+          <w:b/>
+          <w:bCs/>
+          <w:color w:val="8B0000"/>
+        </w:rPr>
+        <w:t>No LTF validation = no Stage 2 alert. No exceptions.</w:t>
+      </w:r>
+    </w:p>
+    <w:p/>
+    <w:p>
+      <w:pPr>
+        <w:spacing w:after="60"/>
+      </w:pPr>
+      <w:r>
+        <w:rPr>
+          <w:b/>
+          <w:bCs/>
+        </w:rPr>
+        <w:t>Step 4 — Two-Stage Alert System:</w:t>
+      </w:r>
+    </w:p>
+    <w:p/>
+    <w:p>
+      <w:pPr>
+        <w:spacing w:after="60"/>
+      </w:pPr>
+      <w:r>
+        <w:rPr>
+          <w:b/>
+          <w:bCs/>
+        </w:rPr>
+        <w:t>Stage 1 — Zone Alert:</w:t>
+      </w:r>
+    </w:p>
+    <w:p>
+      <w:pPr>
+        <w:spacing w:after="60"/>
+      </w:pPr>
+      <w:r>
+        <w:t>Fires immediately when confluence requirement is met (primary + secondary confirmed). Outputs: retracement zone price range, direction, tier, conditions met, and timeout expiry candle count.</w:t>
+      </w:r>
+    </w:p>
+    <w:p>
+      <w:pPr>
+        <w:spacing w:after="60"/>
+      </w:pPr>
+      <w:r>
+        <w:t>Labelled: ZONE ALERT — STANDBY</w:t>
+      </w:r>
+    </w:p>
+    <w:p>
+      <w:pPr>
+        <w:spacing w:after="60"/>
+      </w:pPr>
+      <w:r>
+        <w:t>Delivered via Email only — preparation signal.</w:t>
+      </w:r>
+    </w:p>
+    <w:p/>
+    <w:p>
+      <w:pPr>
+        <w:spacing w:after="60"/>
+      </w:pPr>
+      <w:r>
+        <w:rPr>
+          <w:b/>
+          <w:bCs/>
+        </w:rPr>
+        <w:t>Stage 2 — Execution Alert:</w:t>
+      </w:r>
+    </w:p>
+    <w:p>
+      <w:pPr>
+        <w:spacing w:after="60"/>
+      </w:pPr>
+      <w:r>
+        <w:t>Fires when price enters the zone AND LTF validation is confirmed. This is the full signal output in the required format.</w:t>
+      </w:r>
+    </w:p>
+    <w:p>
+      <w:pPr>
+        <w:spacing w:after="60"/>
+      </w:pPr>
+      <w:r>
+        <w:t>Labelled: EXECUTION ALERT — ENTRY READY</w:t>
+      </w:r>
+    </w:p>
+    <w:p>
+      <w:pPr>
+        <w:spacing w:after="60"/>
+      </w:pPr>
+      <w:r>
         <w:lastRenderedPageBreak/>
-        <w:t>Condition C: FVG left by displacement candle, OB at origin, or imbalance zone</w:t>
-      </w:r>
-    </w:p>
-    <w:p>
-      <w:pPr>
-        <w:pStyle w:val="ListParagraph"/>
-        <w:numPr>
-          <w:ilvl w:val="0"/>
-          <w:numId w:val="2"/>
-        </w:numPr>
-        <w:spacing w:after="40"/>
-      </w:pPr>
-      <w:r>
-        <w:t>Condition B — Continuation: compression boundary — last 1–2 candle bodies forming the boundary before the breakout candle</w:t>
-      </w:r>
-    </w:p>
-    <w:p>
-      <w:pPr>
-        <w:pStyle w:val="ListParagraph"/>
-        <w:numPr>
-          <w:ilvl w:val="0"/>
-          <w:numId w:val="2"/>
-        </w:numPr>
-        <w:spacing w:after="40"/>
-      </w:pPr>
-      <w:r>
-        <w:t>Condition B — Reversal: neckline level at which the pattern trigger candle closed</w:t>
-      </w:r>
-    </w:p>
-    <w:p>
-      <w:pPr>
-        <w:pStyle w:val="ListParagraph"/>
-        <w:numPr>
-          <w:ilvl w:val="0"/>
-          <w:numId w:val="2"/>
-        </w:numPr>
-        <w:spacing w:after="40"/>
-      </w:pPr>
-      <w:r>
-        <w:t>Condition D: retracement zone is defined by the liquidity level interacted with — price is expected to retest the sweep level</w:t>
-      </w:r>
-    </w:p>
-    <w:p/>
-    <w:p>
-      <w:pPr>
-        <w:spacing w:after="60"/>
-      </w:pPr>
-      <w:r>
-        <w:rPr>
-          <w:b/>
-          <w:bCs/>
-        </w:rPr>
-        <w:t>Step 2 — Wait for price to enter the defined zone. LTF validation does not begin until price is inside the zone boundaries.</w:t>
-      </w:r>
-    </w:p>
-    <w:p/>
-    <w:p>
-      <w:pPr>
-        <w:spacing w:after="60"/>
-      </w:pPr>
-      <w:r>
-        <w:rPr>
-          <w:b/>
-          <w:bCs/>
-        </w:rPr>
-        <w:t>Step 3 — Require LTF Validation (1H or 15M):</w:t>
-      </w:r>
-    </w:p>
-    <w:p>
-      <w:pPr>
-        <w:spacing w:after="60"/>
-      </w:pPr>
-      <w:r>
-        <w:t>Price must be inside the defined zone. Then at least ONE of the following must confirm on 1H or 15M:</w:t>
-      </w:r>
-    </w:p>
-    <w:p>
-      <w:pPr>
-        <w:pStyle w:val="ListParagraph"/>
-        <w:numPr>
-          <w:ilvl w:val="0"/>
-          <w:numId w:val="2"/>
-        </w:numPr>
-        <w:spacing w:after="40"/>
-      </w:pPr>
-      <w:r>
-        <w:t>Micro market structure shift in the intended trade direction</w:t>
-      </w:r>
-    </w:p>
-    <w:p>
-      <w:pPr>
-        <w:pStyle w:val="ListParagraph"/>
-        <w:numPr>
-          <w:ilvl w:val="0"/>
-          <w:numId w:val="2"/>
-        </w:numPr>
-        <w:spacing w:after="40"/>
-      </w:pPr>
-      <w:r>
-        <w:t>Displacement candle with body size greater than the prior 3-candle average, closing away from the zone</w:t>
-      </w:r>
-    </w:p>
-    <w:p>
-      <w:pPr>
-        <w:pStyle w:val="ListParagraph"/>
-        <w:numPr>
-          <w:ilvl w:val="0"/>
-          <w:numId w:val="2"/>
-        </w:numPr>
-        <w:spacing w:after="40"/>
-      </w:pPr>
-      <w:r>
-        <w:t>Clear rejection candle with body closing away from the zone boundary — wick into zone, body outside</w:t>
-      </w:r>
-    </w:p>
-    <w:p/>
-    <w:p>
-      <w:pPr>
-        <w:spacing w:after="60"/>
-      </w:pPr>
-      <w:r>
-        <w:t>Optional confluence rule: if two or more LTF conditions occur simultaneously, automatically add +1 to the confidence score before delivery assessment.</w:t>
-      </w:r>
-    </w:p>
-    <w:p/>
-    <w:p>
-      <w:pPr>
-        <w:spacing w:after="100"/>
-      </w:pPr>
-      <w:r>
-        <w:rPr>
-          <w:b/>
-          <w:bCs/>
-          <w:color w:val="8B0000"/>
-        </w:rPr>
-        <w:t>No LTF validation = no Stage 2 alert. No exceptions.</w:t>
-      </w:r>
-    </w:p>
-    <w:p/>
-    <w:p>
-      <w:pPr>
-        <w:spacing w:after="60"/>
-      </w:pPr>
-      <w:r>
-        <w:rPr>
-          <w:b/>
-          <w:bCs/>
-        </w:rPr>
-        <w:t>Step 4 — Two-Stage Alert System:</w:t>
-      </w:r>
-    </w:p>
-    <w:p/>
-    <w:p>
-      <w:pPr>
-        <w:spacing w:after="60"/>
-      </w:pPr>
-      <w:r>
-        <w:rPr>
-          <w:b/>
-          <w:bCs/>
-        </w:rPr>
-        <w:t>Stage 1 — Zone Alert:</w:t>
-      </w:r>
-    </w:p>
-    <w:p>
-      <w:pPr>
-        <w:spacing w:after="60"/>
-      </w:pPr>
-      <w:r>
-        <w:t>Fires immediately when confluence requirement is met (primary + secondary confirmed). Outputs: retracement zone price range, direction, tier, conditions met, and timeout expiry candle count.</w:t>
-      </w:r>
-    </w:p>
-    <w:p>
-      <w:pPr>
-        <w:spacing w:after="60"/>
-      </w:pPr>
-      <w:r>
-        <w:t>Labelled: ZONE ALERT — STANDBY</w:t>
-      </w:r>
-    </w:p>
-    <w:p>
-      <w:pPr>
-        <w:spacing w:after="60"/>
-      </w:pPr>
-      <w:r>
-        <w:t>Delivered via Email only — preparation signal.</w:t>
-      </w:r>
-    </w:p>
-    <w:p/>
-    <w:p>
-      <w:pPr>
-        <w:spacing w:after="60"/>
-      </w:pPr>
-      <w:r>
-        <w:rPr>
-          <w:b/>
-          <w:bCs/>
-        </w:rPr>
-        <w:t>Stage 2 — Execution Alert:</w:t>
-      </w:r>
-    </w:p>
-    <w:p>
-      <w:pPr>
-        <w:spacing w:after="60"/>
-      </w:pPr>
-      <w:r>
-        <w:t>Fires when price enters the zone AND LTF validation is confirmed. This is the full signal output in the required format.</w:t>
-      </w:r>
-    </w:p>
-    <w:p>
-      <w:pPr>
-        <w:spacing w:after="60"/>
-      </w:pPr>
-      <w:r>
-        <w:t>Labelled: EXECUTION ALERT — ENTRY READY</w:t>
-      </w:r>
-    </w:p>
-    <w:p>
-      <w:pPr>
-        <w:spacing w:after="60"/>
-      </w:pPr>
-      <w:r>
         <w:t>Delivered via Email only.</w:t>
       </w:r>
     </w:p>
@@ -2335,7 +2392,6 @@
         <w:spacing w:after="40"/>
       </w:pPr>
       <w:r>
-        <w:lastRenderedPageBreak/>
         <w:t>A new opposing HTF structure forms — defined as a confirmed swing high or low break in the opposite direction. Original setup cancelled. New sequence begins independently</w:t>
       </w:r>
     </w:p>
@@ -2598,6 +2654,7 @@
         <w:spacing w:after="40"/>
       </w:pPr>
       <w:r>
+        <w:lastRenderedPageBreak/>
         <w:t>Volume expansion at structure</w:t>
       </w:r>
     </w:p>
@@ -2702,7 +2759,6 @@
         <w:spacing w:after="40"/>
       </w:pPr>
       <w:r>
-        <w:lastRenderedPageBreak/>
         <w:t>1–4: Weak — suppressed, logged internally only</w:t>
       </w:r>
     </w:p>
@@ -3013,6 +3069,7 @@
         <w:pStyle w:val="Heading1"/>
       </w:pPr>
       <w:r>
+        <w:lastRenderedPageBreak/>
         <w:t>HARD RULES</w:t>
       </w:r>
     </w:p>
@@ -3104,7 +3161,6 @@
         <w:spacing w:after="40"/>
       </w:pPr>
       <w:r>
-        <w:lastRenderedPageBreak/>
         <w:t>SL is always based on candle close invalidation — never a wick touch</w:t>
       </w:r>
     </w:p>
@@ -4063,6 +4119,17 @@
       <w:szCs w:val="20"/>
     </w:rPr>
   </w:style>
+  <w:style w:type="character" w:styleId="Emphasis">
+    <w:name w:val="Emphasis"/>
+    <w:basedOn w:val="DefaultParagraphFont"/>
+    <w:uiPriority w:val="20"/>
+    <w:qFormat/>
+    <w:rsid w:val="003F28CF"/>
+    <w:rPr>
+      <w:i/>
+      <w:iCs/>
+    </w:rPr>
+  </w:style>
 </w:styles>
 </file>
 

</xml_diff>

<commit_message>
Add relative-strength scoring for Tier 3/4 (v5 spec)
Per updated v5 SIGNAL QUALITY SCORING section:
- RS vs BTC over last 20 candles on setup timeframe
- Outperforming (>+2%) adds +1, underperforming (<-2%) deducts -1
- Neutral band has no effect
- Applies to Tier 3 and Tier 4 only (0 for Tier 1/2)
</commit_message>
<xml_diff>
--- a/Trading_Bot_Final_Prompt_v5.docx
+++ b/Trading_Bot_Final_Prompt_v5.docx
@@ -566,8 +566,6 @@
       <w:r>
         <w:t>15M</w:t>
       </w:r>
-      <w:bookmarkStart w:id="0" w:name="_GoBack"/>
-      <w:bookmarkEnd w:id="0"/>
     </w:p>
     <w:p/>
     <w:p>
@@ -2058,15 +2056,7 @@
         <w:pStyle w:val="Heading1"/>
       </w:pPr>
       <w:r>
-        <w:t xml:space="preserve">RETRACEMENT VALIDATION </w:t>
-      </w:r>
-      <w:proofErr w:type="gramStart"/>
-      <w:r>
-        <w:t>LOGIC  [</w:t>
-      </w:r>
-      <w:proofErr w:type="gramEnd"/>
-      <w:r>
-        <w:t>CRITICAL — THE ACTUAL ALERT TRIGGER]</w:t>
+        <w:t>RETRACEMENT VALIDATION LOGIC [CRITICAL — THE ACTUAL ALERT TRIGGER]</w:t>
       </w:r>
     </w:p>
     <w:p>
@@ -2227,6 +2217,8 @@
       <w:r>
         <w:t>Clear rejection candle with body closing away from the zone boundary — wick into zone, body outside</w:t>
       </w:r>
+      <w:bookmarkStart w:id="0" w:name="_GoBack"/>
+      <w:bookmarkEnd w:id="0"/>
     </w:p>
     <w:p/>
     <w:p>
@@ -2237,6 +2229,19 @@
         <w:t>Optional confluence rule: if two or more LTF conditions occur simultaneously, automatically add +1 to the confidence score before delivery assessment.</w:t>
       </w:r>
     </w:p>
+    <w:p>
+      <w:pPr>
+        <w:spacing w:after="60"/>
+      </w:pPr>
+    </w:p>
+    <w:p>
+      <w:pPr>
+        <w:spacing w:after="60"/>
+      </w:pPr>
+      <w:r>
+        <w:t>Trap Warning Check: before Stage 2 fires, verify the following. If two or more of these are present, suppress Stage 2 and deduct 2 points from confidence score: breakout candle followed by immediate range re-entry within 2 candles, volume declining on the breakout candle relative to prior 5-candle average, liquidity sweep without subsequent displacement candle, CVD diverging against breakout direction.</w:t>
+      </w:r>
+    </w:p>
     <w:p/>
     <w:p>
       <w:pPr>
@@ -2298,6 +2303,7 @@
         <w:spacing w:after="60"/>
       </w:pPr>
       <w:r>
+        <w:lastRenderedPageBreak/>
         <w:t>Delivered via Email only — preparation signal.</w:t>
       </w:r>
     </w:p>
@@ -2335,7 +2341,6 @@
         <w:spacing w:after="60"/>
       </w:pPr>
       <w:r>
-        <w:lastRenderedPageBreak/>
         <w:t>Delivered via Email only.</w:t>
       </w:r>
     </w:p>
@@ -2576,6 +2581,7 @@
           <w:b/>
           <w:bCs/>
         </w:rPr>
+        <w:lastRenderedPageBreak/>
         <w:t>Scoring criteria:</w:t>
       </w:r>
     </w:p>
@@ -2654,7 +2660,6 @@
         <w:spacing w:after="40"/>
       </w:pPr>
       <w:r>
-        <w:lastRenderedPageBreak/>
         <w:t>Volume expansion at structure</w:t>
       </w:r>
     </w:p>
@@ -2734,6 +2739,19 @@
       </w:pPr>
       <w:r>
         <w:t>Three or more HTF conditions aligned adds +1 automatically</w:t>
+      </w:r>
+    </w:p>
+    <w:p>
+      <w:pPr>
+        <w:pStyle w:val="ListParagraph"/>
+        <w:numPr>
+          <w:ilvl w:val="0"/>
+          <w:numId w:val="2"/>
+        </w:numPr>
+        <w:spacing w:after="40"/>
+      </w:pPr>
+      <w:r>
+        <w:t>Relative strength vs BTC over last 20 candles on setup timeframe — outperforming adds +1, underperforming deducts -1, neutral no effect. Applies to Tier 3 and Tier 4 only.</w:t>
       </w:r>
     </w:p>
     <w:p/>
@@ -3028,6 +3046,7 @@
           <w:b/>
           <w:bCs/>
         </w:rPr>
+        <w:lastRenderedPageBreak/>
         <w:t>BTC Correlation Context:  one sentence</w:t>
       </w:r>
     </w:p>
@@ -3069,7 +3088,6 @@
         <w:pStyle w:val="Heading1"/>
       </w:pPr>
       <w:r>
-        <w:lastRenderedPageBreak/>
         <w:t>HARD RULES</w:t>
       </w:r>
     </w:p>

</xml_diff>